<commit_message>
Actualizar capítulos 2, 3 y 5 al terreno definitivo (Av. Benito Juárez, col. Riberas del Río)
Co-Authored-By: Claude Opus 5.5 <noreply@anthropic.com>
Claude-Session: https://claude.ai/code/session_01GAnGPTvU3wixsZdV3Y7S1e
</commit_message>
<xml_diff>
--- a/TESIS · CAP 5 · KLM (reescrito).docx
+++ b/TESIS · CAP 5 · KLM (reescrito).docx
@@ -110,7 +110,7 @@
           <w:szCs w:val="24"/>
           <w:lang w:val="en-MX"/>
         </w:rPr>
-        <w:t xml:space="preserve">El problema se vuelve más complejo por la ubicación del terreno. Está sobre un Corredor Urbano de Alto Impacto (CUAI), junto al río La Silla, en una zona donde se cruzan el movimiento de la ciudad, colonias en crecimiento y un ecosistema natural frágil que hoy es Área Natural Protegida. Por eso la arquitectura tiene que lograr unir la ciudad, el paisaje y la función social, sin separar lo construido de lo natural.</w:t>
+        <w:t>El problema se vuelve más complejo por la ubicación del terreno. Está sobre la avenida Benito Juárez, en la colonia Riberas del Río, que es un Corredor Urbano de Alto Impacto (CUAI), y colinda con el río La Silla, en una zona donde se cruzan el movimiento de la ciudad, colonias en crecimiento y un ecosistema natural frágil que hoy es Área Natural Protegida. Por eso la arquitectura tiene que lograr unir la ciudad, el paisaje y la función social, sin separar lo construido de lo natural.</w:t>
       </w:r>
     </w:p>
     <w:p>
@@ -220,7 +220,7 @@
           <w:szCs w:val="24"/>
           <w:lang w:val="en-MX"/>
         </w:rPr>
-        <w:t xml:space="preserve">La variable ambiental tiene que ver con la topografía, el clima semiárido y caluroso, la orientación del terreno y la cercanía con el río La Silla. Estos factores influyen en cómo se acomodan los edificios, en su altura y su forma, en el manejo del agua de lluvia, en la elección de materiales y en el uso de vegetación nativa. La idea es que la arquitectura se adapte al terreno, con su pendiente de entre 6 % y 12 %, sin modificarlo de forma agresiva.</w:t>
+        <w:t>La variable ambiental tiene que ver con la topografía, el clima semiárido y caluroso, la orientación del terreno y la cercanía con el río La Silla. Estos factores influyen en cómo se acomodan los edificios, en su altura y su forma, en el manejo del agua de lluvia, en la elección de materiales y en el uso de vegetación nativa. El terreno, de 5,982 m², es casi plano, con una pendiente de alrededor de 3 %, y colinda por el norte con el río La Silla y por el sur con la avenida Benito Juárez. La idea es que la arquitectura se adapte a estas condiciones sin modificar el terreno de forma agresiva.</w:t>
       </w:r>
     </w:p>
     <w:p>
@@ -3820,7 +3820,7 @@
           <w:szCs w:val="24"/>
           <w:lang w:val="en-MX"/>
         </w:rPr>
-        <w:t xml:space="preserve">Del Pako Street Animal Social Life Campus se retoma la idea de organizar el conjunto como un campus, con edificios separados por función y unidos por áreas abiertas y semiabiertas. También es importante su enfoque de rehabilitación recíproca, donde tanto los perros como las personas se benefician de convivir. Por su escala, con un terreno de 110,000 m², es mucho más grande que el proyecto de Guadalupe, así que se toma como referencia de organización y no de tamaño.</w:t>
+        <w:t>Del Pako Street Animal Social Life Campus se retoma la idea de organizar el conjunto como un campus, con edificios separados por función y unidos por áreas abiertas y semiabiertas. También es importante su enfoque de rehabilitación recíproca, donde tanto los perros como las personas se benefician de convivir. Por su escala, con un terreno de 110,000 m², es mucho más grande que el proyecto de Guadalupe, que tiene 5,982 m², así que se toma como referencia de organización y no de tamaño.</w:t>
       </w:r>
     </w:p>
     <w:p>
@@ -3841,7 +3841,7 @@
           <w:szCs w:val="24"/>
           <w:lang w:val="en-MX"/>
         </w:rPr>
-        <w:t xml:space="preserve">Del refugio y crematorio de Lommel se retoma el patio interior como corazón del proyecto. En ese patio se encuentran los animales con sus nuevos dueños y se hacen presentaciones para escuelas. También es interesante que el proyecto está entre una zona industrial y una reserva natural, una situación parecida a la del terreno de Guadalupe, que queda entre la avenida y el río.</w:t>
+        <w:t>Del refugio y crematorio de Lommel se retoma el patio interior como corazón del proyecto. En ese patio se encuentran los animales con sus nuevos dueños y se hacen presentaciones para escuelas. También es interesante que el proyecto está entre una zona industrial y una reserva natural, una situación parecida a la del terreno de Guadalupe, que queda entre la avenida Benito Juárez y el río La Silla.</w:t>
       </w:r>
     </w:p>
     <w:p>

</xml_diff>